<commit_message>
Paket 07 persiapan instalasi Cilacap: tambah Spesifikasi Material, revisi Pembagian & Daftar Pelaksana (RU IV dukung penuh), keluarkan Draf Material
Co-Authored-By: Claude Opus 5.5 <noreply@anthropic.com>
Claude-Session: https://claude.ai/code/session_01QPUbK2zC1BgtHo8HLyyaSC
</commit_message>
<xml_diff>
--- a/Deliverables/Daftar_Persiapan_Vendor_Instalasi_RU-IV_Cilacap.docx
+++ b/Deliverables/Daftar_Persiapan_Vendor_Instalasi_RU-IV_Cilacap.docx
@@ -60,7 +60,7 @@
           <w:color w:val="1B2A4A"/>
           <w:sz w:val="38"/>
         </w:rPr>
-        <w:t>Daftar Persiapan untuk Vendor Instalasi RU IV Cilacap</w:t>
+        <w:t>Daftar Persiapan untuk Pelaksana Instalasi RU IV Cilacap</w:t>
       </w:r>
     </w:p>
     <w:p>
@@ -73,7 +73,7 @@
           <w:color w:val="5B5B5B"/>
           <w:sz w:val="21"/>
         </w:rPr>
-        <w:t>Dokumen yang diserahkan LAPI Ganesha Utama (LGU) kepada vendor yang ditunjuk Pertamina untuk fabrikasi, mobilisasi, dan pemasangan fisik perangkat GLD Tahap 2 di RU IV Cilacap. Memuat pembagian tanggung jawab, dokumen pendukung, dan checklist yang perlu disiapkan vendor sebelum mobilisasi.</w:t>
+        <w:t>Dokumen yang diserahkan LAPI Ganesha Utama (LGU) kepada tim/kontraktor pelaksana instalasi RU IV Cilacap untuk pekerjaan sipil, fabrikasi, mobilisasi, dan pemasangan fisik perangkat GLD Tahap 2. RU IV telah menyatakan bersedia mendukung penuh pelaksanaan instalasi. Memuat pembagian tanggung jawab, dokumen pendukung, dan checklist yang perlu disiapkan pelaksana sebelum mobilisasi.</w:t>
       </w:r>
     </w:p>
     <w:p>
@@ -173,7 +173,7 @@
               <w:rPr>
                 <w:sz w:val="19"/>
               </w:rPr>
-              <w:t>1.1</w:t>
+              <w:t>1.2</w:t>
             </w:r>
           </w:p>
         </w:tc>
@@ -210,7 +210,7 @@
               <w:rPr>
                 <w:sz w:val="19"/>
               </w:rPr>
-              <w:t>30 September 2026</w:t>
+              <w:t>1 Oktober 2026</w:t>
             </w:r>
           </w:p>
         </w:tc>
@@ -387,7 +387,7 @@
                 <w:b w:val="0"/>
                 <w:sz w:val="17"/>
               </w:rPr>
-              <w:t>Basis desain bracket (CAD), spesifikasi mounting &amp; catu daya, daftar unit, dan checklist acuan — lihat Bagian 2.</w:t>
+              <w:t>Basis desain pelat mounting (CAD), Spesifikasi Material (tiang, kabel, jaringan, BoQ), daftar unit, dan checklist acuan — lihat Bagian 2.</w:t>
             </w:r>
           </w:p>
         </w:tc>
@@ -412,7 +412,7 @@
                 <w:color w:val="1B2A4A"/>
                 <w:sz w:val="19"/>
               </w:rPr>
-              <w:t>Yang harus disiapkan vendor</w:t>
+              <w:t>Yang harus disiapkan pelaksana</w:t>
             </w:r>
           </w:p>
           <w:p>
@@ -421,7 +421,7 @@
                 <w:b w:val="0"/>
                 <w:sz w:val="17"/>
               </w:rPr>
-              <w:t>Izin kerja &amp; TRA/JSA disahkan, personel bersertifikat kerja di ketinggian, material fastener, dan verifikasi titik pasang — lihat Bagian 3.</w:t>
+              <w:t>Izin kerja &amp; TRA/JSA disahkan, personel kompeten (termasuk kerja di ketinggian), material sesuai Spesifikasi Material, dan verifikasi titik pasang — lihat Bagian 3.</w:t>
             </w:r>
           </w:p>
         </w:tc>
@@ -455,14 +455,14 @@
                 <w:b w:val="0"/>
                 <w:sz w:val="17"/>
               </w:rPr>
-              <w:t xml:space="preserve">Vendor mengeksekusi fisik </w:t>
+              <w:t xml:space="preserve">Pelaksana RU IV mengeksekusi fisik </w:t>
             </w:r>
             <w:r>
               <w:rPr>
                 <w:b/>
                 <w:sz w:val="17"/>
               </w:rPr>
-              <w:t>termasuk sertifikasi HSE ketinggian</w:t>
+              <w:t>termasuk K3 &amp; sertifikasi kerja di ketinggian</w:t>
             </w:r>
             <w:r>
               <w:rPr>
@@ -525,7 +525,7 @@
                 <w:b w:val="0"/>
                 <w:sz w:val="19"/>
               </w:rPr>
-              <w:t xml:space="preserve"> Vendor Pertamina adalah pelaksana fisik di lapangan, termasuk kompetensi dan sertifikasi kerja di ketinggian. LGU tidak memasang unit secara fisik — perannya adalah basis desain, supervisi teknis/QA, dan pekerjaan elektrikal yang spesifik ke perangkat GLD.</w:t>
+              <w:t xml:space="preserve"> RU IV mendukung penuh instalasi: tim/kontraktor pelaksana RU IV adalah pelaksana fisik di lapangan, termasuk penyediaan material serta kompetensi dan sertifikasi kerja di ketinggian. LGU tidak memasang unit secara fisik — perannya adalah basis desain, supervisi teknis/QA, dan pekerjaan elektrikal yang spesifik ke perangkat GLD.</w:t>
             </w:r>
           </w:p>
         </w:tc>
@@ -601,7 +601,7 @@
                 <w:b/>
                 <w:sz w:val="18"/>
               </w:rPr>
-              <w:t>Vendor Pertamina</w:t>
+              <w:t>Pelaksana Instalasi RU IV</w:t>
             </w:r>
             <w:r>
               <w:br/>
@@ -611,7 +611,7 @@
                 <w:b w:val="0"/>
                 <w:sz w:val="18"/>
               </w:rPr>
-              <w:t>Pelaksana fisik</w:t>
+              <w:t>Tim/kontraktor RU IV — pelaksana fisik</w:t>
             </w:r>
           </w:p>
         </w:tc>
@@ -628,7 +628,7 @@
                 <w:b w:val="0"/>
                 <w:sz w:val="18"/>
               </w:rPr>
-              <w:t>Verifikasi ukuran &amp; kondisi struktur di lapangan, shop drawing, fabrikasi bracket sesuai basis desain, mobilisasi, pemasangan fisik bracket/CH/sensor node, kompetensi &amp; sertifikasi HSE kerja di ketinggian, alat kerja &amp; APD, metode kerja, dan izin kerja lapangan.</w:t>
+              <w:t>Verifikasi titik pasang di lapangan, pekerjaan sipil (galian &amp; cor tiang/mast), shop drawing, fabrikasi pelat mounting sesuai basis desain, instalasi PSU &amp; kabel, mobilisasi, pemasangan fisik bracket/CH/sensor node, kompetensi &amp; sertifikasi HSE kerja di ketinggian, alat kerja &amp; APD, metode kerja, dan izin kerja lapangan.</w:t>
             </w:r>
           </w:p>
         </w:tc>
@@ -722,7 +722,7 @@
                 <w:b w:val="0"/>
                 <w:sz w:val="18"/>
               </w:rPr>
-              <w:t>Penetapan titik/area pasang, klasifikasi area (safe/hazardous), akses struktur, izin kerja &amp; persetujuan HSE/operasi, penugasan resmi vendor, penyediaan PC dedicated dekat Gateway, serta catu daya 24 VDC (kabel &amp; PSU) ke titik pasang.</w:t>
+              <w:t>Penetapan titik/area pasang, klasifikasi area (safe/hazardous), akses struktur, izin kerja &amp; persetujuan HSE/operasi, penetapan tim/kontraktor pelaksana, penyediaan material instalasi, PC server di ruang server lokal, serta catu daya 24 VDC (kabel &amp; PSU) ke titik pasang.</w:t>
             </w:r>
           </w:p>
         </w:tc>
@@ -752,7 +752,42 @@
         <w:pStyle w:val="Heading1"/>
       </w:pPr>
       <w:r>
-        <w:t>2. Dokumen &amp; lampiran yang diserahkan ke vendor</w:t>
+        <w:t>2. Dokumen &amp; lampiran yang diserahkan ke pelaksana</w:t>
+      </w:r>
+    </w:p>
+    <w:p>
+      <w:pPr>
+        <w:pStyle w:val="ListBullet"/>
+        <w:spacing w:after="60"/>
+      </w:pPr>
+      <w:r>
+        <w:rPr>
+          <w:b/>
+          <w:sz w:val="19"/>
+        </w:rPr>
+        <w:t>Spesifikasi Material &amp; Kebutuhan Instalasi GLD (rev 1.4, 1 Oktober 2026)</w:t>
+      </w:r>
+      <w:r>
+        <w:rPr>
+          <w:b w:val="0"/>
+          <w:sz w:val="19"/>
+        </w:rPr>
+        <w:t xml:space="preserve"> — tiang besi (ditanam &amp; dicor), tinggi sensor, kabel 24 VDC (2 opsi PSU, ukuran vs panjang), mast &amp; koaksial antena Gateway, skema jaringan lokal, fastener, BoQ, dan pertanyaan yang perlu diputuskan: </w:t>
+      </w:r>
+      <w:r>
+        <w:rPr>
+          <w:rFonts w:ascii="Consolas" w:hAnsi="Consolas"/>
+          <w:color w:val="5B5B5B"/>
+          <w:sz w:val="18"/>
+        </w:rPr>
+        <w:t>Spesifikasi_Material_Instalasi_GLD_RU-IV_Cilacap.pdf</w:t>
+      </w:r>
+      <w:r>
+        <w:rPr>
+          <w:b w:val="0"/>
+          <w:sz w:val="19"/>
+        </w:rPr>
+        <w:t>.</w:t>
       </w:r>
     </w:p>
     <w:p>
@@ -997,45 +1032,10 @@
     </w:p>
     <w:p>
       <w:pPr>
-        <w:pStyle w:val="ListBullet"/>
-        <w:spacing w:after="60"/>
-      </w:pPr>
-      <w:r>
-        <w:rPr>
-          <w:b/>
-          <w:sz w:val="19"/>
-        </w:rPr>
-        <w:t>Cover sheet penyerahan desain bracket</w:t>
-      </w:r>
-      <w:r>
-        <w:rPr>
-          <w:b w:val="0"/>
-          <w:sz w:val="19"/>
-        </w:rPr>
-        <w:t xml:space="preserve"> (ringkasan basis desain &amp; wajib konfirmasi vendor): </w:t>
-      </w:r>
-      <w:r>
-        <w:rPr>
-          <w:rFonts w:ascii="Consolas" w:hAnsi="Consolas"/>
-          <w:color w:val="5B5B5B"/>
-          <w:sz w:val="18"/>
-        </w:rPr>
-        <w:t>Deliverables/Petunjuk_Penyerahan_Desain_Bracket_ke_Vendor_RU-IV.md</w:t>
-      </w:r>
-      <w:r>
-        <w:rPr>
-          <w:b w:val="0"/>
-          <w:sz w:val="19"/>
-        </w:rPr>
-        <w:t>.</w:t>
-      </w:r>
-    </w:p>
-    <w:p>
-      <w:pPr>
         <w:pStyle w:val="Heading1"/>
       </w:pPr>
       <w:r>
-        <w:t>3. Checklist persiapan vendor sebelum mobilisasi</w:t>
+        <w:t>3. Checklist persiapan pelaksana sebelum mobilisasi</w:t>
       </w:r>
     </w:p>
     <w:p>
@@ -1398,7 +1398,7 @@
                 <w:b w:val="0"/>
                 <w:sz w:val="18"/>
               </w:rPr>
-              <w:t>Personel bersertifikat kerja di ketinggian (sesuai titik pasang) — sertifikasi HSE ketinggian tanggung jawab vendor, bukan LGU.</w:t>
+              <w:t>Personel bersertifikat kerja di ketinggian (sesuai titik pasang) — sertifikasi kerja di ketinggian tanggung jawab pelaksana RU IV, bukan LGU.</w:t>
             </w:r>
           </w:p>
         </w:tc>
@@ -1416,7 +1416,7 @@
                 <w:color w:val="B23A3A"/>
                 <w:sz w:val="17"/>
               </w:rPr>
-              <w:t xml:space="preserve"> TANGGUNG JAWAB VENDOR </w:t>
+              <w:t xml:space="preserve"> TANGGUNG JAWAB PELAKSANA </w:t>
             </w:r>
           </w:p>
         </w:tc>
@@ -1454,7 +1454,7 @@
                 <w:b w:val="0"/>
                 <w:sz w:val="18"/>
               </w:rPr>
-              <w:t>Supervisor lapangan vendor ditunjuk, dengan jalur komunikasi ke supervisor QA LGU dan PIC HSE/control room RU IV.</w:t>
+              <w:t>Supervisor lapangan pelaksana ditunjuk, dengan jalur komunikasi ke supervisor QA LGU dan PIC HSE/control room RU IV.</w:t>
             </w:r>
           </w:p>
         </w:tc>
@@ -1594,7 +1594,7 @@
                 <w:b w:val="0"/>
                 <w:sz w:val="18"/>
               </w:rPr>
-              <w:t>Bracket L + U-bolt sesuai basis desain (2"/DN50, OD pipa 60,3 mm, M10; inside width 62–65 mm, inside height 95–100 mm, panjang ulir rekomendasi 40 mm).</w:t>
+              <w:t>Tiang baru pipa baja galvanis 2" Sch40 (OD 60,3 mm), ditanam &amp; dicor: GLD 1,6 m (1,0 m di atas tanah), CH 4,0 m, mast antena Gateway 6,0 m — detail di Spesifikasi Material §3.</w:t>
             </w:r>
           </w:p>
         </w:tc>
@@ -1612,7 +1612,7 @@
                 <w:color w:val="8A6D1E"/>
                 <w:sz w:val="17"/>
               </w:rPr>
-              <w:t xml:space="preserve"> FABRIKASI VENDOR/SHOP DRAWING </w:t>
+              <w:t xml:space="preserve"> PENGADAAN PELAKSANA </w:t>
             </w:r>
           </w:p>
         </w:tc>
@@ -1650,7 +1650,7 @@
                 <w:b w:val="0"/>
                 <w:sz w:val="18"/>
               </w:rPr>
-              <w:t>Mur/baut/washer, kunci ukuran sesuai, material anti-korosi, dan pelat spacer bila diperlukan. Hindari PVC.</w:t>
+              <w:t>Pelat mounting U-bolt sesuai basis desain (2"/DN50, OD pipa 60,3 mm, M10; inside width 62–65 mm, inside height 95–100 mm, panjang ulir rekomendasi 40 mm).</w:t>
             </w:r>
           </w:p>
         </w:tc>
@@ -1669,7 +1669,7 @@
                 <w:color w:val="8A6D1E"/>
                 <w:sz w:val="17"/>
               </w:rPr>
-              <w:t xml:space="preserve"> DETAIL FASTENER TERBUKA </w:t>
+              <w:t xml:space="preserve"> FABRIKASI PELAKSANA/SHOP DRAWING </w:t>
             </w:r>
           </w:p>
         </w:tc>
@@ -1705,7 +1705,7 @@
                 <w:b w:val="0"/>
                 <w:sz w:val="18"/>
               </w:rPr>
-              <w:t>Alat kerja standar (torque wrench, alat ukur, alat angkat/tangga/scaffolding sesuai metode kerja), APD lengkap, LOTO, dan gas test bila dipersyaratkan area.</w:t>
+              <w:t>Mur/baut/washer, kunci ukuran sesuai, material anti-korosi, dan pelat spacer bila diperlukan. Hindari PVC.</w:t>
             </w:r>
           </w:p>
         </w:tc>
@@ -1723,7 +1723,7 @@
                 <w:color w:val="8A6D1E"/>
                 <w:sz w:val="17"/>
               </w:rPr>
-              <w:t xml:space="preserve"> PERLU RENCANA KERJA </w:t>
+              <w:t xml:space="preserve"> DETAIL FASTENER TERBUKA </w:t>
             </w:r>
           </w:p>
         </w:tc>
@@ -1761,6 +1761,61 @@
                 <w:b w:val="0"/>
                 <w:sz w:val="18"/>
               </w:rPr>
+              <w:t>Alat kerja standar (torque wrench, alat ukur, alat angkat/tangga/scaffolding sesuai metode kerja), APD lengkap, LOTO, dan gas test bila dipersyaratkan area.</w:t>
+            </w:r>
+          </w:p>
+        </w:tc>
+        <w:tc>
+          <w:tcPr>
+            <w:tcW w:type="dxa" w:w="3324"/>
+            <w:shd w:val="clear" w:color="auto" w:fill="FAFAF8"/>
+          </w:tcPr>
+          <w:p>
+            <w:pPr>
+              <w:spacing w:after="40"/>
+            </w:pPr>
+            <w:r>
+              <w:rPr>
+                <w:b/>
+                <w:color w:val="8A6D1E"/>
+                <w:sz w:val="17"/>
+              </w:rPr>
+              <w:t xml:space="preserve"> PERLU RENCANA KERJA </w:t>
+            </w:r>
+          </w:p>
+        </w:tc>
+      </w:tr>
+      <w:tr>
+        <w:tc>
+          <w:tcPr>
+            <w:tcW w:type="dxa" w:w="3324"/>
+          </w:tcPr>
+          <w:p>
+            <w:pPr>
+              <w:spacing w:after="40"/>
+            </w:pPr>
+            <w:r>
+              <w:rPr>
+                <w:b w:val="0"/>
+                <w:sz w:val="18"/>
+              </w:rPr>
+              <w:t>☐</w:t>
+            </w:r>
+          </w:p>
+        </w:tc>
+        <w:tc>
+          <w:tcPr>
+            <w:tcW w:type="dxa" w:w="3324"/>
+          </w:tcPr>
+          <w:p>
+            <w:pPr>
+              <w:spacing w:after="40"/>
+            </w:pPr>
+            <w:r>
+              <w:rPr>
+                <w:b w:val="0"/>
+                <w:sz w:val="18"/>
+              </w:rPr>
               <w:t>Tanpa pengelasan atau pengeboran struktur permanen kecuali metode disetujui tertulis oleh RU IV.</w:t>
             </w:r>
           </w:p>
@@ -1768,7 +1823,6 @@
         <w:tc>
           <w:tcPr>
             <w:tcW w:type="dxa" w:w="3324"/>
-            <w:shd w:val="clear" w:color="auto" w:fill="FAFAF8"/>
           </w:tcPr>
           <w:p>
             <w:pPr>
@@ -1901,7 +1955,7 @@
                 <w:b w:val="0"/>
                 <w:sz w:val="18"/>
               </w:rPr>
-              <w:t>Diameter luar, bentuk, material, dan kondisi aktual struktur pemasangan di setiap titik (GLD, CH, Gateway).</w:t>
+              <w:t>Kondisi tanah/perkerasan dan utilitas bawah tanah (kabel/pipa) di setiap titik tiang sebelum galian (GLD, CH, mast Gateway).</w:t>
             </w:r>
           </w:p>
         </w:tc>
@@ -1919,7 +1973,7 @@
                 <w:color w:val="8A6D1E"/>
                 <w:sz w:val="17"/>
               </w:rPr>
-              <w:t xml:space="preserve"> VERIFIKASI VENDOR </w:t>
+              <w:t xml:space="preserve"> VERIFIKASI PELAKSANA </w:t>
             </w:r>
           </w:p>
         </w:tc>
@@ -1957,21 +2011,21 @@
                 <w:b w:val="0"/>
                 <w:sz w:val="18"/>
               </w:rPr>
-              <w:t xml:space="preserve">Orientasi pemasangan: tiang vertikal atau handrail/pipa horizontal. </w:t>
+              <w:t xml:space="preserve">Orientasi pelat mounting pada tiang vertikal baru. </w:t>
             </w:r>
             <w:r>
               <w:rPr>
                 <w:b/>
                 <w:sz w:val="18"/>
               </w:rPr>
-              <w:t>Desain CAD saat ini belum diverifikasi tertulis untuk kedua orientasi tanpa varian/rotasi</w:t>
+              <w:t>Desain CAD saat ini paling sesuai untuk pipa horizontal dan belum diverifikasi tertulis untuk tiang vertikal</w:t>
             </w:r>
             <w:r>
               <w:rPr>
                 <w:b w:val="0"/>
                 <w:sz w:val="18"/>
               </w:rPr>
-              <w:t xml:space="preserve"> — konfirmasi sebelum fabrikasi massal.</w:t>
+              <w:t xml:space="preserve"> — konfirmasi bersama tim desain LGU sebelum fabrikasi.</w:t>
             </w:r>
           </w:p>
         </w:tc>
@@ -2044,7 +2098,7 @@
                 <w:color w:val="8A6D1E"/>
                 <w:sz w:val="17"/>
               </w:rPr>
-              <w:t xml:space="preserve"> VERIFIKASI VENDOR </w:t>
+              <w:t xml:space="preserve"> VERIFIKASI PELAKSANA </w:t>
             </w:r>
           </w:p>
         </w:tc>
@@ -2278,7 +2332,7 @@
                 <w:b w:val="0"/>
                 <w:sz w:val="18"/>
               </w:rPr>
-              <w:t>Titik catu daya 24 VDC ≥1 A per unit GLD — kabel &amp; PSU disediakan RU IV/kilang; vendor menyiapkan jalur kabel, proteksi, terminasi, dan identifikasi kabel sesuai instruksi LGU/RU IV.</w:t>
+              <w:t>Titik catu daya 24 VDC ≥1 A per unit GLD — kabel &amp; PSU disediakan RU IV; pelaksana memasang PSU, jalur kabel (ukuran per Spesifikasi Material §4), proteksi, terminasi mekanik, dan identifikasi kabel.</w:t>
             </w:r>
           </w:p>
         </w:tc>
@@ -2333,7 +2387,7 @@
                 <w:b w:val="0"/>
                 <w:sz w:val="18"/>
               </w:rPr>
-              <w:t>Energize dan terminasi elektrikal spesifik GLD dipimpin LGU — vendor menyiapkan akses &amp; kondisi aman untuk pekerjaan ini, bukan mengeksekusi terminasi sendiri.</w:t>
+              <w:t>Energize dan terminasi elektrikal spesifik GLD dipimpin LGU — pelaksana menyiapkan akses &amp; kondisi aman untuk pekerjaan ini, bukan mengeksekusi terminasi sendiri.</w:t>
             </w:r>
           </w:p>
         </w:tc>
@@ -2528,7 +2582,7 @@
                 <w:b w:val="0"/>
                 <w:sz w:val="18"/>
               </w:rPr>
-              <w:t>Daftar kontak: PIC operasi RU IV, HSE, control room, IT, vendor, dan supervisor QA LGU — termasuk jalur stop-work.</w:t>
+              <w:t>Daftar kontak: PIC operasi RU IV, HSE, control room, IT, pelaksana instalasi, dan supervisor QA LGU — termasuk jalur stop-work.</w:t>
             </w:r>
           </w:p>
         </w:tc>
@@ -2617,7 +2671,7 @@
         <w:pStyle w:val="Heading1"/>
       </w:pPr>
       <w:r>
-        <w:t>4. Wajib dikonfirmasi vendor ke LGU/RU IV sebelum mulai kerja</w:t>
+        <w:t>4. Wajib dikonfirmasi pelaksana ke LGU/RU IV sebelum mulai kerja</w:t>
       </w:r>
     </w:p>
     <w:p>
@@ -2643,7 +2697,20 @@
           <w:b w:val="0"/>
           <w:sz w:val="19"/>
         </w:rPr>
-        <w:t>Orientasi struktur eksisting (tiang vertikal atau handrail horizontal) di tiap titik — dicocokkan dengan desain CAD sebelum fabrikasi massal.</w:t>
+        <w:t>Kecocokan pelat mounting U-bolt pada tiang vertikal baru — dicocokkan dengan desain CAD bersama tim desain LGU sebelum fabrikasi.</w:t>
+      </w:r>
+    </w:p>
+    <w:p>
+      <w:pPr>
+        <w:pStyle w:val="ListBullet"/>
+        <w:spacing w:after="60"/>
+      </w:pPr>
+      <w:r>
+        <w:rPr>
+          <w:b w:val="0"/>
+          <w:sz w:val="19"/>
+        </w:rPr>
+        <w:t>Lokasi mast antena Gateway dan rute kabel koaksial ke ruang Gateway (target ≤15 m), serta jarak ruang Gateway ke ruang server lokal (kabel Cat6).</w:t>
       </w:r>
     </w:p>
     <w:p>
@@ -2832,7 +2899,7 @@
           <w:b w:val="0"/>
           <w:sz w:val="19"/>
         </w:rPr>
-        <w:t>Energize, terminasi elektrikal spesifik GLD, dan commissioning/uji fungsional hanya dilakukan oleh LGU bersama HSE/control room — bukan oleh vendor secara mandiri.</w:t>
+        <w:t>Energize, terminasi elektrikal spesifik GLD, dan commissioning/uji fungsional hanya dilakukan oleh LGU bersama HSE/control room — bukan oleh pelaksana secara mandiri.</w:t>
       </w:r>
     </w:p>
     <w:p>
@@ -2882,7 +2949,7 @@
                 <w:b/>
                 <w:sz w:val="19"/>
               </w:rPr>
-              <w:t>Vendor Instalasi Pertamina RU IV</w:t>
+              <w:t>Pelaksana Instalasi RU IV</w:t>
             </w:r>
             <w:r>
               <w:br/>
@@ -2959,7 +3026,7 @@
         <w:color w:val="5B5B5B"/>
         <w:sz w:val="16"/>
       </w:rPr>
-      <w:t>LGU/GLD/INSTALASI-VENDOR/2026-001  ·  Rev. 1.1</w:t>
+      <w:t>LGU/GLD/INSTALASI-VENDOR/2026-001  ·  Rev. 1.2</w:t>
     </w:r>
     <w:r>
       <w:rPr>
@@ -3050,7 +3117,7 @@
         <w:color w:val="5B5B5B"/>
         <w:sz w:val="16"/>
       </w:rPr>
-      <w:t>Daftar Persiapan Vendor Instalasi — RU IV Cilacap  |  Draf Kerja — Konfidensial</w:t>
+      <w:t>Daftar Persiapan Pelaksana Instalasi — RU IV Cilacap  |  Draf Kerja — Konfidensial</w:t>
     </w:r>
   </w:p>
 </w:hdr>

</xml_diff>